<commit_message>
Payment request: setup options, Private €1,500, VAT exempt, contact; add generator and handoff spec
Co-Authored-By: Claude Opus 5.5 <noreply@anthropic.com>
Claude-Session: https://claude.ai/code/session_014L7u4metkPTAViywXArhiW
</commit_message>
<xml_diff>
--- a/docs/Payset_Payment_Request_Template.docx
+++ b/docs/Payset_Payment_Request_Template.docx
@@ -369,29 +369,6 @@
                 <w:sz w:val="18"/>
                 <w:szCs w:val="18"/>
               </w:rPr>
-              <w:t xml:space="preserve">Plan  </w:t>
-            </w:r>
-            <w:r>
-              <w:rPr>
-                <w:rFonts w:ascii="Arial" w:cs="Arial" w:eastAsia="Arial" w:hAnsi="Arial"/>
-                <w:color w:val="1A1A1A"/>
-                <w:sz w:val="20"/>
-                <w:szCs w:val="20"/>
-              </w:rPr>
-              <w:t xml:space="preserve">[Business]</w:t>
-            </w:r>
-          </w:p>
-          <w:p>
-            <w:pPr>
-              <w:spacing w:after="40" w:before="0"/>
-            </w:pPr>
-            <w:r>
-              <w:rPr>
-                <w:rFonts w:ascii="Arial" w:cs="Arial" w:eastAsia="Arial" w:hAnsi="Arial"/>
-                <w:color w:val="646464"/>
-                <w:sz w:val="18"/>
-                <w:szCs w:val="18"/>
-              </w:rPr>
               <w:t xml:space="preserve">Payment due  </w:t>
             </w:r>
             <w:r>
@@ -409,7 +386,226 @@
     </w:tbl>
     <w:p>
       <w:pPr>
-        <w:spacing w:after="160" w:before="160"/>
+        <w:spacing w:after="60" w:before="120"/>
+      </w:pPr>
+      <w:r>
+        <w:rPr>
+          <w:rFonts w:ascii="Arial" w:cs="Arial" w:eastAsia="Arial" w:hAnsi="Arial"/>
+          <w:b/>
+          <w:bCs/>
+          <w:color w:val="256C4A"/>
+          <w:sz w:val="16"/>
+          <w:szCs w:val="16"/>
+        </w:rPr>
+        <w:t xml:space="preserve">SETUP OPTIONS</w:t>
+      </w:r>
+    </w:p>
+    <w:p>
+      <w:pPr>
+        <w:spacing w:after="40" w:before="0"/>
+      </w:pPr>
+      <w:r>
+        <w:rPr>
+          <w:rFonts w:ascii="Arial" w:cs="Arial" w:eastAsia="Arial" w:hAnsi="Arial"/>
+          <w:color w:val="646464"/>
+          <w:sz w:val="18"/>
+          <w:szCs w:val="18"/>
+        </w:rPr>
+        <w:t xml:space="preserve">Company location  </w:t>
+      </w:r>
+      <w:sdt>
+        <w:sdtPr>
+          <w14:checkbox>
+            <w14:checked w14:val="0"/>
+            <w14:checkedState w14:val="2612" w14:font="Segoe UI Symbol"/>
+            <w14:uncheckedState w14:val="2610" w14:font="Segoe UI Symbol"/>
+          </w14:checkbox>
+        </w:sdtPr>
+        <w:sdtContent>
+          <w:r>
+            <w:sym w:char="2610" w:font="Segoe UI Symbol"/>
+          </w:r>
+        </w:sdtContent>
+      </w:sdt>
+      <w:r>
+        <w:rPr>
+          <w:rFonts w:ascii="Arial" w:cs="Arial" w:eastAsia="Arial" w:hAnsi="Arial"/>
+          <w:color w:val="1A1A1A"/>
+          <w:sz w:val="20"/>
+          <w:szCs w:val="20"/>
+        </w:rPr>
+        <w:t xml:space="preserve"> EU / UK: €500 setup fee      </w:t>
+      </w:r>
+      <w:sdt>
+        <w:sdtPr>
+          <w14:checkbox>
+            <w14:checked w14:val="0"/>
+            <w14:checkedState w14:val="2612" w14:font="Segoe UI Symbol"/>
+            <w14:uncheckedState w14:val="2610" w14:font="Segoe UI Symbol"/>
+          </w14:checkbox>
+        </w:sdtPr>
+        <w:sdtContent>
+          <w:r>
+            <w:sym w:char="2610" w:font="Segoe UI Symbol"/>
+          </w:r>
+        </w:sdtContent>
+      </w:sdt>
+      <w:r>
+        <w:rPr>
+          <w:rFonts w:ascii="Arial" w:cs="Arial" w:eastAsia="Arial" w:hAnsi="Arial"/>
+          <w:color w:val="1A1A1A"/>
+          <w:sz w:val="20"/>
+          <w:szCs w:val="20"/>
+        </w:rPr>
+        <w:t xml:space="preserve"> Non-EU/UK: €1,000 setup fee      </w:t>
+      </w:r>
+    </w:p>
+    <w:p>
+      <w:pPr>
+        <w:spacing w:after="40" w:before="0"/>
+      </w:pPr>
+      <w:r>
+        <w:rPr>
+          <w:rFonts w:ascii="Arial" w:cs="Arial" w:eastAsia="Arial" w:hAnsi="Arial"/>
+          <w:color w:val="646464"/>
+          <w:sz w:val="18"/>
+          <w:szCs w:val="18"/>
+        </w:rPr>
+        <w:t xml:space="preserve">Complex structure  </w:t>
+      </w:r>
+      <w:sdt>
+        <w:sdtPr>
+          <w14:checkbox>
+            <w14:checked w14:val="0"/>
+            <w14:checkedState w14:val="2612" w14:font="Segoe UI Symbol"/>
+            <w14:uncheckedState w14:val="2610" w14:font="Segoe UI Symbol"/>
+          </w14:checkbox>
+        </w:sdtPr>
+        <w:sdtContent>
+          <w:r>
+            <w:sym w:char="2610" w:font="Segoe UI Symbol"/>
+          </w:r>
+        </w:sdtContent>
+      </w:sdt>
+      <w:r>
+        <w:rPr>
+          <w:rFonts w:ascii="Arial" w:cs="Arial" w:eastAsia="Arial" w:hAnsi="Arial"/>
+          <w:color w:val="1A1A1A"/>
+          <w:sz w:val="20"/>
+          <w:szCs w:val="20"/>
+        </w:rPr>
+        <w:t xml:space="preserve"> No      </w:t>
+      </w:r>
+      <w:sdt>
+        <w:sdtPr>
+          <w14:checkbox>
+            <w14:checked w14:val="0"/>
+            <w14:checkedState w14:val="2612" w14:font="Segoe UI Symbol"/>
+            <w14:uncheckedState w14:val="2610" w14:font="Segoe UI Symbol"/>
+          </w14:checkbox>
+        </w:sdtPr>
+        <w:sdtContent>
+          <w:r>
+            <w:sym w:char="2610" w:font="Segoe UI Symbol"/>
+          </w:r>
+        </w:sdtContent>
+      </w:sdt>
+      <w:r>
+        <w:rPr>
+          <w:rFonts w:ascii="Arial" w:cs="Arial" w:eastAsia="Arial" w:hAnsi="Arial"/>
+          <w:color w:val="1A1A1A"/>
+          <w:sz w:val="20"/>
+          <w:szCs w:val="20"/>
+        </w:rPr>
+        <w:t xml:space="preserve"> Yes: +€500      </w:t>
+      </w:r>
+    </w:p>
+    <w:p>
+      <w:pPr>
+        <w:spacing w:after="40" w:before="0"/>
+      </w:pPr>
+      <w:r>
+        <w:rPr>
+          <w:rFonts w:ascii="Arial" w:cs="Arial" w:eastAsia="Arial" w:hAnsi="Arial"/>
+          <w:color w:val="646464"/>
+          <w:sz w:val="18"/>
+          <w:szCs w:val="18"/>
+        </w:rPr>
+        <w:t xml:space="preserve">Plan  </w:t>
+      </w:r>
+      <w:sdt>
+        <w:sdtPr>
+          <w14:checkbox>
+            <w14:checked w14:val="0"/>
+            <w14:checkedState w14:val="2612" w14:font="Segoe UI Symbol"/>
+            <w14:uncheckedState w14:val="2610" w14:font="Segoe UI Symbol"/>
+          </w14:checkbox>
+        </w:sdtPr>
+        <w:sdtContent>
+          <w:r>
+            <w:sym w:char="2610" w:font="Segoe UI Symbol"/>
+          </w:r>
+        </w:sdtContent>
+      </w:sdt>
+      <w:r>
+        <w:rPr>
+          <w:rFonts w:ascii="Arial" w:cs="Arial" w:eastAsia="Arial" w:hAnsi="Arial"/>
+          <w:color w:val="1A1A1A"/>
+          <w:sz w:val="20"/>
+          <w:szCs w:val="20"/>
+        </w:rPr>
+        <w:t xml:space="preserve"> Business €100/mo      </w:t>
+      </w:r>
+      <w:sdt>
+        <w:sdtPr>
+          <w14:checkbox>
+            <w14:checked w14:val="0"/>
+            <w14:checkedState w14:val="2612" w14:font="Segoe UI Symbol"/>
+            <w14:uncheckedState w14:val="2610" w14:font="Segoe UI Symbol"/>
+          </w14:checkbox>
+        </w:sdtPr>
+        <w:sdtContent>
+          <w:r>
+            <w:sym w:char="2610" w:font="Segoe UI Symbol"/>
+          </w:r>
+        </w:sdtContent>
+      </w:sdt>
+      <w:r>
+        <w:rPr>
+          <w:rFonts w:ascii="Arial" w:cs="Arial" w:eastAsia="Arial" w:hAnsi="Arial"/>
+          <w:color w:val="1A1A1A"/>
+          <w:sz w:val="20"/>
+          <w:szCs w:val="20"/>
+        </w:rPr>
+        <w:t xml:space="preserve"> Scale €300/mo      </w:t>
+      </w:r>
+      <w:sdt>
+        <w:sdtPr>
+          <w14:checkbox>
+            <w14:checked w14:val="0"/>
+            <w14:checkedState w14:val="2612" w14:font="Segoe UI Symbol"/>
+            <w14:uncheckedState w14:val="2610" w14:font="Segoe UI Symbol"/>
+          </w14:checkbox>
+        </w:sdtPr>
+        <w:sdtContent>
+          <w:r>
+            <w:sym w:char="2610" w:font="Segoe UI Symbol"/>
+          </w:r>
+        </w:sdtContent>
+      </w:sdt>
+      <w:r>
+        <w:rPr>
+          <w:rFonts w:ascii="Arial" w:cs="Arial" w:eastAsia="Arial" w:hAnsi="Arial"/>
+          <w:color w:val="1A1A1A"/>
+          <w:sz w:val="20"/>
+          <w:szCs w:val="20"/>
+        </w:rPr>
+        <w:t xml:space="preserve"> Private €1,500/mo      </w:t>
+      </w:r>
+    </w:p>
+    <w:p>
+      <w:pPr>
+        <w:spacing w:after="120" w:before="120"/>
       </w:pPr>
       <w:r>
         <w:rPr>
@@ -625,7 +821,7 @@
                 <w:sz w:val="17"/>
                 <w:szCs w:val="17"/>
               </w:rPr>
-              <w:t xml:space="preserve">One-time. €500 EU/UK company, €1,000 non-EU/UK company, plus €500 for a complex structure.</w:t>
+              <w:t xml:space="preserve">One-time. €500 for an EU/UK company, €1,000 for a non-EU/UK company.</w:t>
             </w:r>
           </w:p>
         </w:tc>
@@ -733,7 +929,7 @@
             <w:tcBorders>
               <w:top w:val="none" w:color="FFFFFF" w:sz="0"/>
               <w:left w:val="none" w:color="FFFFFF" w:sz="0"/>
-              <w:bottom w:val="none" w:color="FFFFFF" w:sz="0"/>
+              <w:bottom w:val="single" w:color="D9D4CE" w:sz="4"/>
               <w:right w:val="none" w:color="FFFFFF" w:sz="0"/>
             </w:tcBorders>
             <w:tcMar>
@@ -756,7 +952,7 @@
                 <w:sz w:val="20"/>
                 <w:szCs w:val="20"/>
               </w:rPr>
-              <w:t xml:space="preserve">Monthly plan fee: [Business]</w:t>
+              <w:t xml:space="preserve">Complex structure</w:t>
             </w:r>
             <w:r>
               <w:br/>
@@ -768,7 +964,150 @@
                 <w:sz w:val="17"/>
                 <w:szCs w:val="17"/>
               </w:rPr>
-              <w:t xml:space="preserve">First three months, paid in advance: [Month 1] to [Month 3]. Business €100, Scale €300, Private [agreed fee].</w:t>
+              <w:t xml:space="preserve">One-time, only if ticked above. Otherwise enter 0.</w:t>
+            </w:r>
+          </w:p>
+        </w:tc>
+        <w:tc>
+          <w:tcPr>
+            <w:tcW w:type="dxa" w:w="1500"/>
+            <w:tcBorders>
+              <w:top w:val="none" w:color="FFFFFF" w:sz="0"/>
+              <w:left w:val="none" w:color="FFFFFF" w:sz="0"/>
+              <w:bottom w:val="single" w:color="D9D4CE" w:sz="4"/>
+              <w:right w:val="none" w:color="FFFFFF" w:sz="0"/>
+            </w:tcBorders>
+            <w:tcMar>
+              <w:top w:type="dxa" w:w="110"/>
+              <w:left w:type="dxa" w:w="120"/>
+              <w:bottom w:type="dxa" w:w="110"/>
+              <w:right w:type="dxa" w:w="120"/>
+            </w:tcMar>
+          </w:tcPr>
+          <w:p>
+            <w:pPr>
+              <w:spacing w:after="0" w:before="0"/>
+              <w:jc w:val="right"/>
+            </w:pPr>
+            <w:r>
+              <w:rPr>
+                <w:rFonts w:ascii="Arial" w:cs="Arial" w:eastAsia="Arial" w:hAnsi="Arial"/>
+                <w:color w:val="1A1A1A"/>
+                <w:sz w:val="20"/>
+                <w:szCs w:val="20"/>
+              </w:rPr>
+              <w:t xml:space="preserve">[0]</w:t>
+            </w:r>
+          </w:p>
+        </w:tc>
+        <w:tc>
+          <w:tcPr>
+            <w:tcW w:type="dxa" w:w="1500"/>
+            <w:tcBorders>
+              <w:top w:val="none" w:color="FFFFFF" w:sz="0"/>
+              <w:left w:val="none" w:color="FFFFFF" w:sz="0"/>
+              <w:bottom w:val="single" w:color="D9D4CE" w:sz="4"/>
+              <w:right w:val="none" w:color="FFFFFF" w:sz="0"/>
+            </w:tcBorders>
+            <w:tcMar>
+              <w:top w:type="dxa" w:w="110"/>
+              <w:left w:type="dxa" w:w="120"/>
+              <w:bottom w:type="dxa" w:w="110"/>
+              <w:right w:type="dxa" w:w="120"/>
+            </w:tcMar>
+          </w:tcPr>
+          <w:p>
+            <w:pPr>
+              <w:spacing w:after="0" w:before="0"/>
+              <w:jc w:val="right"/>
+            </w:pPr>
+            <w:r>
+              <w:rPr>
+                <w:rFonts w:ascii="Arial" w:cs="Arial" w:eastAsia="Arial" w:hAnsi="Arial"/>
+                <w:color w:val="1A1A1A"/>
+                <w:sz w:val="20"/>
+                <w:szCs w:val="20"/>
+              </w:rPr>
+              <w:t xml:space="preserve">€500.00</w:t>
+            </w:r>
+          </w:p>
+        </w:tc>
+        <w:tc>
+          <w:tcPr>
+            <w:tcW w:type="dxa" w:w="1600"/>
+            <w:tcBorders>
+              <w:top w:val="none" w:color="FFFFFF" w:sz="0"/>
+              <w:left w:val="none" w:color="FFFFFF" w:sz="0"/>
+              <w:bottom w:val="single" w:color="D9D4CE" w:sz="4"/>
+              <w:right w:val="none" w:color="FFFFFF" w:sz="0"/>
+            </w:tcBorders>
+            <w:tcMar>
+              <w:top w:type="dxa" w:w="110"/>
+              <w:left w:type="dxa" w:w="120"/>
+              <w:bottom w:type="dxa" w:w="110"/>
+              <w:right w:type="dxa" w:w="120"/>
+            </w:tcMar>
+          </w:tcPr>
+          <w:p>
+            <w:pPr>
+              <w:spacing w:after="0" w:before="0"/>
+              <w:jc w:val="right"/>
+            </w:pPr>
+            <w:r>
+              <w:rPr>
+                <w:rFonts w:ascii="Arial" w:cs="Arial" w:eastAsia="Arial" w:hAnsi="Arial"/>
+                <w:color w:val="1A1A1A"/>
+                <w:sz w:val="20"/>
+                <w:szCs w:val="20"/>
+              </w:rPr>
+              <w:t xml:space="preserve">€[0.00]</w:t>
+            </w:r>
+          </w:p>
+        </w:tc>
+      </w:tr>
+      <w:tr>
+        <w:tc>
+          <w:tcPr>
+            <w:tcW w:type="dxa" w:w="5038"/>
+            <w:tcBorders>
+              <w:top w:val="none" w:color="FFFFFF" w:sz="0"/>
+              <w:left w:val="none" w:color="FFFFFF" w:sz="0"/>
+              <w:bottom w:val="none" w:color="FFFFFF" w:sz="0"/>
+              <w:right w:val="none" w:color="FFFFFF" w:sz="0"/>
+            </w:tcBorders>
+            <w:tcMar>
+              <w:top w:type="dxa" w:w="110"/>
+              <w:left w:type="dxa" w:w="120"/>
+              <w:bottom w:type="dxa" w:w="110"/>
+              <w:right w:type="dxa" w:w="120"/>
+            </w:tcMar>
+          </w:tcPr>
+          <w:p>
+            <w:pPr>
+              <w:spacing w:after="0" w:before="0"/>
+            </w:pPr>
+            <w:r>
+              <w:rPr>
+                <w:rFonts w:ascii="Arial" w:cs="Arial" w:eastAsia="Arial" w:hAnsi="Arial"/>
+                <w:b/>
+                <w:bCs/>
+                <w:color w:val="1A1A1A"/>
+                <w:sz w:val="20"/>
+                <w:szCs w:val="20"/>
+              </w:rPr>
+              <w:t xml:space="preserve">Monthly plan fee: [Business]</w:t>
+            </w:r>
+            <w:r>
+              <w:br/>
+            </w:r>
+            <w:r>
+              <w:rPr>
+                <w:rFonts w:ascii="Arial" w:cs="Arial" w:eastAsia="Arial" w:hAnsi="Arial"/>
+                <w:color w:val="646464"/>
+                <w:sz w:val="17"/>
+                <w:szCs w:val="17"/>
+              </w:rPr>
+              <w:t xml:space="preserve">First three months, paid in advance: [Month 1] to [Month 3]. Business €100, Scale €300, Private €1,500.</w:t>
             </w:r>
           </w:p>
         </w:tc>
@@ -1074,7 +1413,7 @@
                 <w:sz w:val="20"/>
                 <w:szCs w:val="20"/>
               </w:rPr>
-              <w:t xml:space="preserve">[Exempt / €0.00]</w:t>
+              <w:t xml:space="preserve">Exempt</w:t>
             </w:r>
           </w:p>
         </w:tc>
@@ -1619,7 +1958,7 @@
           <w:sz w:val="20"/>
           <w:szCs w:val="20"/>
         </w:rPr>
-        <w:t xml:space="preserve">Your account opens as soon as this payment is received in full. Until then, your account details can receive this payment only.</w:t>
+        <w:t xml:space="preserve">Your account opens as soon as this payment is received in full.</w:t>
       </w:r>
     </w:p>
     <w:p>
@@ -1669,7 +2008,7 @@
           <w:sz w:val="20"/>
           <w:szCs w:val="20"/>
         </w:rPr>
-        <w:t xml:space="preserve">Please use the reference above so we can match your payment quickly. Intermediary bank charges are paid by the sender.</w:t>
+        <w:t xml:space="preserve">Use the reference above. Intermediary bank charges are paid by the sender. This request is valid for 30 days; after that your approval lapses.</w:t>
       </w:r>
     </w:p>
     <w:p>
@@ -1694,32 +2033,7 @@
           <w:sz w:val="20"/>
           <w:szCs w:val="20"/>
         </w:rPr>
-        <w:t xml:space="preserve">This request is valid for [30] days. If it is not paid by then, your approval lapses and a new application is needed.</w:t>
-      </w:r>
-    </w:p>
-    <w:p>
-      <w:pPr>
-        <w:spacing w:after="40" w:before="0"/>
-      </w:pPr>
-      <w:r>
-        <w:rPr>
-          <w:rFonts w:ascii="Arial" w:cs="Arial" w:eastAsia="Arial" w:hAnsi="Arial"/>
-          <w:b/>
-          <w:bCs/>
-          <w:color w:val="256C4A"/>
-          <w:sz w:val="20"/>
-          <w:szCs w:val="20"/>
-        </w:rPr>
-        <w:t xml:space="preserve">•  </w:t>
-      </w:r>
-      <w:r>
-        <w:rPr>
-          <w:rFonts w:ascii="Arial" w:cs="Arial" w:eastAsia="Arial" w:hAnsi="Arial"/>
-          <w:color w:val="1A1A1A"/>
-          <w:sz w:val="20"/>
-          <w:szCs w:val="20"/>
-        </w:rPr>
-        <w:t xml:space="preserve">Questions? Contact your Payset team at [email] or [phone].</w:t>
+        <w:t xml:space="preserve">Questions? Contact your Payset team at business@payset.io.</w:t>
       </w:r>
     </w:p>
     <w:sectPr>

</xml_diff>

<commit_message>
Business is UK/EU only; non-EU/UK setup fee applies to Scale and Private
Co-Authored-By: Claude Opus 5.5 <noreply@anthropic.com>
Claude-Session: https://claude.ai/code/session_014L7u4metkPTAViywXArhiW
</commit_message>
<xml_diff>
--- a/docs/Payset_Payment_Request_Template.docx
+++ b/docs/Payset_Payment_Request_Template.docx
@@ -457,7 +457,7 @@
           <w:sz w:val="20"/>
           <w:szCs w:val="20"/>
         </w:rPr>
-        <w:t xml:space="preserve"> Non-EU/UK: €1,000 setup fee      </w:t>
+        <w:t xml:space="preserve"> Non-EU/UK: €1,000 setup fee (Scale or Private only)      </w:t>
       </w:r>
     </w:p>
     <w:p>
@@ -821,7 +821,7 @@
                 <w:sz w:val="17"/>
                 <w:szCs w:val="17"/>
               </w:rPr>
-              <w:t xml:space="preserve">One-time. €500 for an EU/UK company, €1,000 for a non-EU/UK company.</w:t>
+              <w:t xml:space="preserve">One-time. €500 for an EU/UK company, €1,000 for a non-EU/UK company (Scale and Private only).</w:t>
             </w:r>
           </w:p>
         </w:tc>

</xml_diff>